<commit_message>
Update files for Querying and Relating SQL DB
</commit_message>
<xml_diff>
--- a/Querying/Exercises/36 Views/36 Views.docx
+++ b/Querying/Exercises/36 Views/36 Views.docx
@@ -1415,6 +1415,673 @@
     </w:p>
     <w:p>
       <w:pPr>
+        <w:spacing w:before="100" w:beforeAutospacing="1" w:after="0" w:line="240" w:lineRule="auto"/>
+        <w:rPr>
+          <w:rFonts w:ascii="Tahoma" w:eastAsia="Times New Roman" w:hAnsi="Tahoma" w:cs="Tahoma"/>
+          <w:color w:val="000000" w:themeColor="text1"/>
+          <w:kern w:val="0"/>
+          <w:lang w:eastAsia="en-GB"/>
+          <w14:ligatures w14:val="none"/>
+        </w:rPr>
+      </w:pPr>
+    </w:p>
+    <w:p>
+      <w:pPr>
+        <w:pStyle w:val="Heading2"/>
+        <w:pBdr>
+          <w:bottom w:val="single" w:sz="6" w:space="0" w:color="E9ECEF"/>
+        </w:pBdr>
+        <w:spacing w:before="0" w:after="0"/>
+        <w:rPr>
+          <w:rFonts w:ascii="PT Sans" w:hAnsi="PT Sans"/>
+          <w:color w:val="212529"/>
+        </w:rPr>
+      </w:pPr>
+      <w:hyperlink r:id="rId16" w:anchor="how-to-test" w:history="1">
+        <w:r>
+          <w:rPr>
+            <w:rStyle w:val="Hyperlink"/>
+            <w:rFonts w:ascii="PT Sans" w:hAnsi="PT Sans"/>
+            <w:u w:val="none"/>
+          </w:rPr>
+          <w:t>How to Test</w:t>
+        </w:r>
+      </w:hyperlink>
+    </w:p>
+    <w:p>
+      <w:pPr>
+        <w:pStyle w:val="NormalWeb"/>
+        <w:spacing w:before="0" w:beforeAutospacing="0" w:after="0"/>
+        <w:rPr>
+          <w:rFonts w:ascii="PT Sans" w:hAnsi="PT Sans"/>
+          <w:color w:val="212529"/>
+        </w:rPr>
+      </w:pPr>
+      <w:r>
+        <w:rPr>
+          <w:rFonts w:ascii="PT Sans" w:hAnsi="PT Sans"/>
+          <w:color w:val="212529"/>
+        </w:rPr>
+        <w:t>While</w:t>
+      </w:r>
+      <w:r>
+        <w:rPr>
+          <w:rStyle w:val="apple-converted-space"/>
+          <w:rFonts w:ascii="PT Sans" w:hAnsi="PT Sans"/>
+          <w:color w:val="212529"/>
+        </w:rPr>
+        <w:t> </w:t>
+      </w:r>
+      <w:r>
+        <w:rPr>
+          <w:rStyle w:val="HTMLCode"/>
+          <w:rFonts w:ascii="var(--bs-font-monospace)" w:hAnsi="var(--bs-font-monospace)"/>
+          <w:color w:val="212529"/>
+          <w:sz w:val="21"/>
+          <w:szCs w:val="21"/>
+        </w:rPr>
+        <w:t>check50</w:t>
+      </w:r>
+      <w:r>
+        <w:rPr>
+          <w:rStyle w:val="apple-converted-space"/>
+          <w:rFonts w:ascii="PT Sans" w:hAnsi="PT Sans"/>
+          <w:color w:val="212529"/>
+        </w:rPr>
+        <w:t> </w:t>
+      </w:r>
+      <w:r>
+        <w:rPr>
+          <w:rFonts w:ascii="PT Sans" w:hAnsi="PT Sans"/>
+          <w:color w:val="212529"/>
+        </w:rPr>
+        <w:t>is available for this problem, you’re encouraged to instead test your code on your own for each of the following. If you’re using the</w:t>
+      </w:r>
+      <w:r>
+        <w:rPr>
+          <w:rStyle w:val="apple-converted-space"/>
+          <w:rFonts w:ascii="PT Sans" w:hAnsi="PT Sans"/>
+          <w:color w:val="212529"/>
+        </w:rPr>
+        <w:t> </w:t>
+      </w:r>
+      <w:r>
+        <w:rPr>
+          <w:rStyle w:val="HTMLCode"/>
+          <w:rFonts w:ascii="var(--bs-font-monospace)" w:hAnsi="var(--bs-font-monospace)"/>
+          <w:color w:val="212529"/>
+          <w:sz w:val="21"/>
+          <w:szCs w:val="21"/>
+        </w:rPr>
+        <w:t>views.db</w:t>
+      </w:r>
+      <w:r>
+        <w:rPr>
+          <w:rStyle w:val="apple-converted-space"/>
+          <w:rFonts w:ascii="PT Sans" w:hAnsi="PT Sans"/>
+          <w:color w:val="212529"/>
+        </w:rPr>
+        <w:t> </w:t>
+      </w:r>
+      <w:r>
+        <w:rPr>
+          <w:rFonts w:ascii="PT Sans" w:hAnsi="PT Sans"/>
+          <w:color w:val="212529"/>
+        </w:rPr>
+        <w:t>database provided in this problem’s distribution, you should find that…</w:t>
+      </w:r>
+    </w:p>
+    <w:p>
+      <w:pPr>
+        <w:numPr>
+          <w:ilvl w:val="0"/>
+          <w:numId w:val="3"/>
+        </w:numPr>
+        <w:spacing w:before="100" w:beforeAutospacing="1" w:after="0" w:afterAutospacing="1" w:line="240" w:lineRule="auto"/>
+        <w:rPr>
+          <w:rFonts w:ascii="PT Sans" w:hAnsi="PT Sans"/>
+          <w:color w:val="212529"/>
+        </w:rPr>
+      </w:pPr>
+      <w:r>
+        <w:rPr>
+          <w:rFonts w:ascii="PT Sans" w:hAnsi="PT Sans"/>
+          <w:color w:val="212529"/>
+        </w:rPr>
+        <w:t>Executing</w:t>
+      </w:r>
+      <w:r>
+        <w:rPr>
+          <w:rStyle w:val="apple-converted-space"/>
+          <w:rFonts w:ascii="PT Sans" w:hAnsi="PT Sans"/>
+          <w:color w:val="212529"/>
+        </w:rPr>
+        <w:t> </w:t>
+      </w:r>
+      <w:r>
+        <w:rPr>
+          <w:rStyle w:val="HTMLCode"/>
+          <w:rFonts w:ascii="var(--bs-font-monospace)" w:eastAsiaTheme="minorHAnsi" w:hAnsi="var(--bs-font-monospace)"/>
+          <w:color w:val="212529"/>
+          <w:sz w:val="21"/>
+          <w:szCs w:val="21"/>
+        </w:rPr>
+        <w:t>1.sql</w:t>
+      </w:r>
+      <w:r>
+        <w:rPr>
+          <w:rStyle w:val="apple-converted-space"/>
+          <w:rFonts w:ascii="PT Sans" w:hAnsi="PT Sans"/>
+          <w:color w:val="212529"/>
+        </w:rPr>
+        <w:t> </w:t>
+      </w:r>
+      <w:r>
+        <w:rPr>
+          <w:rFonts w:ascii="PT Sans" w:hAnsi="PT Sans"/>
+          <w:color w:val="212529"/>
+        </w:rPr>
+        <w:t>results in a table with 2 columns and 72 rows.</w:t>
+      </w:r>
+    </w:p>
+    <w:p>
+      <w:pPr>
+        <w:numPr>
+          <w:ilvl w:val="0"/>
+          <w:numId w:val="3"/>
+        </w:numPr>
+        <w:spacing w:before="100" w:beforeAutospacing="1" w:after="0" w:afterAutospacing="1" w:line="240" w:lineRule="auto"/>
+        <w:rPr>
+          <w:rFonts w:ascii="PT Sans" w:hAnsi="PT Sans"/>
+          <w:color w:val="212529"/>
+        </w:rPr>
+      </w:pPr>
+      <w:r>
+        <w:rPr>
+          <w:rFonts w:ascii="PT Sans" w:hAnsi="PT Sans"/>
+          <w:color w:val="212529"/>
+        </w:rPr>
+        <w:t>Executing</w:t>
+      </w:r>
+      <w:r>
+        <w:rPr>
+          <w:rStyle w:val="apple-converted-space"/>
+          <w:rFonts w:ascii="PT Sans" w:hAnsi="PT Sans"/>
+          <w:color w:val="212529"/>
+        </w:rPr>
+        <w:t> </w:t>
+      </w:r>
+      <w:r>
+        <w:rPr>
+          <w:rStyle w:val="HTMLCode"/>
+          <w:rFonts w:ascii="var(--bs-font-monospace)" w:eastAsiaTheme="minorHAnsi" w:hAnsi="var(--bs-font-monospace)"/>
+          <w:color w:val="212529"/>
+          <w:sz w:val="21"/>
+          <w:szCs w:val="21"/>
+        </w:rPr>
+        <w:t>2.sql</w:t>
+      </w:r>
+      <w:r>
+        <w:rPr>
+          <w:rStyle w:val="apple-converted-space"/>
+          <w:rFonts w:ascii="PT Sans" w:hAnsi="PT Sans"/>
+          <w:color w:val="212529"/>
+        </w:rPr>
+        <w:t> </w:t>
+      </w:r>
+      <w:r>
+        <w:rPr>
+          <w:rFonts w:ascii="PT Sans" w:hAnsi="PT Sans"/>
+          <w:color w:val="212529"/>
+        </w:rPr>
+        <w:t>results in a table with 1 column and 3 rows.</w:t>
+      </w:r>
+    </w:p>
+    <w:p>
+      <w:pPr>
+        <w:numPr>
+          <w:ilvl w:val="0"/>
+          <w:numId w:val="3"/>
+        </w:numPr>
+        <w:spacing w:before="100" w:beforeAutospacing="1" w:after="0" w:afterAutospacing="1" w:line="240" w:lineRule="auto"/>
+        <w:rPr>
+          <w:rFonts w:ascii="PT Sans" w:hAnsi="PT Sans"/>
+          <w:color w:val="212529"/>
+        </w:rPr>
+      </w:pPr>
+      <w:r>
+        <w:rPr>
+          <w:rFonts w:ascii="PT Sans" w:hAnsi="PT Sans"/>
+          <w:color w:val="212529"/>
+        </w:rPr>
+        <w:t>Executing</w:t>
+      </w:r>
+      <w:r>
+        <w:rPr>
+          <w:rStyle w:val="apple-converted-space"/>
+          <w:rFonts w:ascii="PT Sans" w:hAnsi="PT Sans"/>
+          <w:color w:val="212529"/>
+        </w:rPr>
+        <w:t> </w:t>
+      </w:r>
+      <w:r>
+        <w:rPr>
+          <w:rStyle w:val="HTMLCode"/>
+          <w:rFonts w:ascii="var(--bs-font-monospace)" w:eastAsiaTheme="minorHAnsi" w:hAnsi="var(--bs-font-monospace)"/>
+          <w:color w:val="212529"/>
+          <w:sz w:val="21"/>
+          <w:szCs w:val="21"/>
+        </w:rPr>
+        <w:t>3.sql</w:t>
+      </w:r>
+      <w:r>
+        <w:rPr>
+          <w:rStyle w:val="apple-converted-space"/>
+          <w:rFonts w:ascii="PT Sans" w:hAnsi="PT Sans"/>
+          <w:color w:val="212529"/>
+        </w:rPr>
+        <w:t> </w:t>
+      </w:r>
+      <w:r>
+        <w:rPr>
+          <w:rFonts w:ascii="PT Sans" w:hAnsi="PT Sans"/>
+          <w:color w:val="212529"/>
+        </w:rPr>
+        <w:t>results in a table with 1 column and 1 row.</w:t>
+      </w:r>
+    </w:p>
+    <w:p>
+      <w:pPr>
+        <w:numPr>
+          <w:ilvl w:val="0"/>
+          <w:numId w:val="3"/>
+        </w:numPr>
+        <w:spacing w:before="100" w:beforeAutospacing="1" w:after="0" w:afterAutospacing="1" w:line="240" w:lineRule="auto"/>
+        <w:rPr>
+          <w:rFonts w:ascii="PT Sans" w:hAnsi="PT Sans"/>
+          <w:color w:val="212529"/>
+        </w:rPr>
+      </w:pPr>
+      <w:r>
+        <w:rPr>
+          <w:rFonts w:ascii="PT Sans" w:hAnsi="PT Sans"/>
+          <w:color w:val="212529"/>
+        </w:rPr>
+        <w:t>Executing</w:t>
+      </w:r>
+      <w:r>
+        <w:rPr>
+          <w:rStyle w:val="apple-converted-space"/>
+          <w:rFonts w:ascii="PT Sans" w:hAnsi="PT Sans"/>
+          <w:color w:val="212529"/>
+        </w:rPr>
+        <w:t> </w:t>
+      </w:r>
+      <w:r>
+        <w:rPr>
+          <w:rStyle w:val="HTMLCode"/>
+          <w:rFonts w:ascii="var(--bs-font-monospace)" w:eastAsiaTheme="minorHAnsi" w:hAnsi="var(--bs-font-monospace)"/>
+          <w:color w:val="212529"/>
+          <w:sz w:val="21"/>
+          <w:szCs w:val="21"/>
+        </w:rPr>
+        <w:t>4.sql</w:t>
+      </w:r>
+      <w:r>
+        <w:rPr>
+          <w:rStyle w:val="apple-converted-space"/>
+          <w:rFonts w:ascii="PT Sans" w:hAnsi="PT Sans"/>
+          <w:color w:val="212529"/>
+        </w:rPr>
+        <w:t> </w:t>
+      </w:r>
+      <w:r>
+        <w:rPr>
+          <w:rFonts w:ascii="PT Sans" w:hAnsi="PT Sans"/>
+          <w:color w:val="212529"/>
+        </w:rPr>
+        <w:t>results in a table with 1 column and 1 row.</w:t>
+      </w:r>
+    </w:p>
+    <w:p>
+      <w:pPr>
+        <w:numPr>
+          <w:ilvl w:val="0"/>
+          <w:numId w:val="3"/>
+        </w:numPr>
+        <w:spacing w:before="100" w:beforeAutospacing="1" w:after="0" w:afterAutospacing="1" w:line="240" w:lineRule="auto"/>
+        <w:rPr>
+          <w:rFonts w:ascii="PT Sans" w:hAnsi="PT Sans"/>
+          <w:color w:val="212529"/>
+        </w:rPr>
+      </w:pPr>
+      <w:r>
+        <w:rPr>
+          <w:rFonts w:ascii="PT Sans" w:hAnsi="PT Sans"/>
+          <w:color w:val="212529"/>
+        </w:rPr>
+        <w:lastRenderedPageBreak/>
+        <w:t>Executing</w:t>
+      </w:r>
+      <w:r>
+        <w:rPr>
+          <w:rStyle w:val="apple-converted-space"/>
+          <w:rFonts w:ascii="PT Sans" w:hAnsi="PT Sans"/>
+          <w:color w:val="212529"/>
+        </w:rPr>
+        <w:t> </w:t>
+      </w:r>
+      <w:r>
+        <w:rPr>
+          <w:rStyle w:val="HTMLCode"/>
+          <w:rFonts w:ascii="var(--bs-font-monospace)" w:eastAsiaTheme="minorHAnsi" w:hAnsi="var(--bs-font-monospace)"/>
+          <w:color w:val="212529"/>
+          <w:sz w:val="21"/>
+          <w:szCs w:val="21"/>
+        </w:rPr>
+        <w:t>5.sql</w:t>
+      </w:r>
+      <w:r>
+        <w:rPr>
+          <w:rStyle w:val="apple-converted-space"/>
+          <w:rFonts w:ascii="PT Sans" w:hAnsi="PT Sans"/>
+          <w:color w:val="212529"/>
+        </w:rPr>
+        <w:t> </w:t>
+      </w:r>
+      <w:r>
+        <w:rPr>
+          <w:rFonts w:ascii="PT Sans" w:hAnsi="PT Sans"/>
+          <w:color w:val="212529"/>
+        </w:rPr>
+        <w:t>results in a table with 1 column and 1 row.</w:t>
+      </w:r>
+    </w:p>
+    <w:p>
+      <w:pPr>
+        <w:numPr>
+          <w:ilvl w:val="0"/>
+          <w:numId w:val="3"/>
+        </w:numPr>
+        <w:spacing w:before="100" w:beforeAutospacing="1" w:after="0" w:afterAutospacing="1" w:line="240" w:lineRule="auto"/>
+        <w:rPr>
+          <w:rFonts w:ascii="PT Sans" w:hAnsi="PT Sans"/>
+          <w:color w:val="212529"/>
+        </w:rPr>
+      </w:pPr>
+      <w:r>
+        <w:rPr>
+          <w:rFonts w:ascii="PT Sans" w:hAnsi="PT Sans"/>
+          <w:color w:val="212529"/>
+        </w:rPr>
+        <w:t>Executing</w:t>
+      </w:r>
+      <w:r>
+        <w:rPr>
+          <w:rStyle w:val="apple-converted-space"/>
+          <w:rFonts w:ascii="PT Sans" w:hAnsi="PT Sans"/>
+          <w:color w:val="212529"/>
+        </w:rPr>
+        <w:t> </w:t>
+      </w:r>
+      <w:r>
+        <w:rPr>
+          <w:rStyle w:val="HTMLCode"/>
+          <w:rFonts w:ascii="var(--bs-font-monospace)" w:eastAsiaTheme="minorHAnsi" w:hAnsi="var(--bs-font-monospace)"/>
+          <w:color w:val="212529"/>
+          <w:sz w:val="21"/>
+          <w:szCs w:val="21"/>
+        </w:rPr>
+        <w:t>6.sql</w:t>
+      </w:r>
+      <w:r>
+        <w:rPr>
+          <w:rStyle w:val="apple-converted-space"/>
+          <w:rFonts w:ascii="PT Sans" w:hAnsi="PT Sans"/>
+          <w:color w:val="212529"/>
+        </w:rPr>
+        <w:t> </w:t>
+      </w:r>
+      <w:r>
+        <w:rPr>
+          <w:rFonts w:ascii="PT Sans" w:hAnsi="PT Sans"/>
+          <w:color w:val="212529"/>
+        </w:rPr>
+        <w:t>results in a table with 1 column and 1 row.</w:t>
+      </w:r>
+    </w:p>
+    <w:p>
+      <w:pPr>
+        <w:numPr>
+          <w:ilvl w:val="0"/>
+          <w:numId w:val="3"/>
+        </w:numPr>
+        <w:spacing w:before="100" w:beforeAutospacing="1" w:after="0" w:afterAutospacing="1" w:line="240" w:lineRule="auto"/>
+        <w:rPr>
+          <w:rFonts w:ascii="PT Sans" w:hAnsi="PT Sans"/>
+          <w:color w:val="212529"/>
+        </w:rPr>
+      </w:pPr>
+      <w:r>
+        <w:rPr>
+          <w:rFonts w:ascii="PT Sans" w:hAnsi="PT Sans"/>
+          <w:color w:val="212529"/>
+        </w:rPr>
+        <w:t>Executing</w:t>
+      </w:r>
+      <w:r>
+        <w:rPr>
+          <w:rStyle w:val="apple-converted-space"/>
+          <w:rFonts w:ascii="PT Sans" w:hAnsi="PT Sans"/>
+          <w:color w:val="212529"/>
+        </w:rPr>
+        <w:t> </w:t>
+      </w:r>
+      <w:r>
+        <w:rPr>
+          <w:rStyle w:val="HTMLCode"/>
+          <w:rFonts w:ascii="var(--bs-font-monospace)" w:eastAsiaTheme="minorHAnsi" w:hAnsi="var(--bs-font-monospace)"/>
+          <w:color w:val="212529"/>
+          <w:sz w:val="21"/>
+          <w:szCs w:val="21"/>
+        </w:rPr>
+        <w:t>7.sql</w:t>
+      </w:r>
+      <w:r>
+        <w:rPr>
+          <w:rStyle w:val="apple-converted-space"/>
+          <w:rFonts w:ascii="PT Sans" w:hAnsi="PT Sans"/>
+          <w:color w:val="212529"/>
+        </w:rPr>
+        <w:t> </w:t>
+      </w:r>
+      <w:r>
+        <w:rPr>
+          <w:rFonts w:ascii="PT Sans" w:hAnsi="PT Sans"/>
+          <w:color w:val="212529"/>
+        </w:rPr>
+        <w:t>results in a table with 1 column and 5 rows.</w:t>
+      </w:r>
+    </w:p>
+    <w:p>
+      <w:pPr>
+        <w:numPr>
+          <w:ilvl w:val="0"/>
+          <w:numId w:val="3"/>
+        </w:numPr>
+        <w:spacing w:before="100" w:beforeAutospacing="1" w:after="0" w:afterAutospacing="1" w:line="240" w:lineRule="auto"/>
+        <w:rPr>
+          <w:rFonts w:ascii="PT Sans" w:hAnsi="PT Sans"/>
+          <w:color w:val="212529"/>
+        </w:rPr>
+      </w:pPr>
+      <w:r>
+        <w:rPr>
+          <w:rFonts w:ascii="PT Sans" w:hAnsi="PT Sans"/>
+          <w:color w:val="212529"/>
+        </w:rPr>
+        <w:t>Executing</w:t>
+      </w:r>
+      <w:r>
+        <w:rPr>
+          <w:rStyle w:val="apple-converted-space"/>
+          <w:rFonts w:ascii="PT Sans" w:hAnsi="PT Sans"/>
+          <w:color w:val="212529"/>
+        </w:rPr>
+        <w:t> </w:t>
+      </w:r>
+      <w:r>
+        <w:rPr>
+          <w:rStyle w:val="HTMLCode"/>
+          <w:rFonts w:ascii="var(--bs-font-monospace)" w:eastAsiaTheme="minorHAnsi" w:hAnsi="var(--bs-font-monospace)"/>
+          <w:color w:val="212529"/>
+          <w:sz w:val="21"/>
+          <w:szCs w:val="21"/>
+        </w:rPr>
+        <w:t>8.sql</w:t>
+      </w:r>
+      <w:r>
+        <w:rPr>
+          <w:rStyle w:val="apple-converted-space"/>
+          <w:rFonts w:ascii="PT Sans" w:hAnsi="PT Sans"/>
+          <w:color w:val="212529"/>
+        </w:rPr>
+        <w:t> </w:t>
+      </w:r>
+      <w:r>
+        <w:rPr>
+          <w:rFonts w:ascii="PT Sans" w:hAnsi="PT Sans"/>
+          <w:color w:val="212529"/>
+        </w:rPr>
+        <w:t>results in a table with 1 column and 5 rows.</w:t>
+      </w:r>
+    </w:p>
+    <w:p>
+      <w:pPr>
+        <w:numPr>
+          <w:ilvl w:val="0"/>
+          <w:numId w:val="3"/>
+        </w:numPr>
+        <w:spacing w:before="100" w:beforeAutospacing="1" w:after="0" w:line="240" w:lineRule="auto"/>
+        <w:rPr>
+          <w:rFonts w:ascii="PT Sans" w:hAnsi="PT Sans"/>
+          <w:color w:val="212529"/>
+        </w:rPr>
+      </w:pPr>
+      <w:r>
+        <w:rPr>
+          <w:rFonts w:ascii="PT Sans" w:hAnsi="PT Sans"/>
+          <w:color w:val="212529"/>
+        </w:rPr>
+        <w:t>Executing</w:t>
+      </w:r>
+      <w:r>
+        <w:rPr>
+          <w:rStyle w:val="apple-converted-space"/>
+          <w:rFonts w:ascii="PT Sans" w:hAnsi="PT Sans"/>
+          <w:color w:val="212529"/>
+        </w:rPr>
+        <w:t> </w:t>
+      </w:r>
+      <w:r>
+        <w:rPr>
+          <w:rStyle w:val="HTMLCode"/>
+          <w:rFonts w:ascii="var(--bs-font-monospace)" w:eastAsiaTheme="minorHAnsi" w:hAnsi="var(--bs-font-monospace)"/>
+          <w:color w:val="212529"/>
+          <w:sz w:val="21"/>
+          <w:szCs w:val="21"/>
+        </w:rPr>
+        <w:t>9.sql</w:t>
+      </w:r>
+      <w:r>
+        <w:rPr>
+          <w:rStyle w:val="apple-converted-space"/>
+          <w:rFonts w:ascii="PT Sans" w:hAnsi="PT Sans"/>
+          <w:color w:val="212529"/>
+        </w:rPr>
+        <w:t> </w:t>
+      </w:r>
+      <w:r>
+        <w:rPr>
+          <w:rFonts w:ascii="PT Sans" w:hAnsi="PT Sans"/>
+          <w:color w:val="212529"/>
+        </w:rPr>
+        <w:t>results in a table with 2 columns and 1 row.</w:t>
+      </w:r>
+    </w:p>
+    <w:p>
+      <w:pPr>
+        <w:pStyle w:val="NormalWeb"/>
+        <w:spacing w:before="0" w:beforeAutospacing="0" w:after="0"/>
+        <w:rPr>
+          <w:rFonts w:ascii="PT Sans" w:hAnsi="PT Sans"/>
+          <w:color w:val="212529"/>
+        </w:rPr>
+      </w:pPr>
+      <w:r>
+        <w:rPr>
+          <w:rStyle w:val="HTMLCode"/>
+          <w:rFonts w:ascii="var(--bs-font-monospace)" w:hAnsi="var(--bs-font-monospace)"/>
+          <w:color w:val="212529"/>
+          <w:sz w:val="21"/>
+          <w:szCs w:val="21"/>
+        </w:rPr>
+        <w:t>10.sql</w:t>
+      </w:r>
+      <w:r>
+        <w:rPr>
+          <w:rStyle w:val="apple-converted-space"/>
+          <w:rFonts w:ascii="PT Sans" w:hAnsi="PT Sans"/>
+          <w:color w:val="212529"/>
+        </w:rPr>
+        <w:t> </w:t>
+      </w:r>
+      <w:r>
+        <w:rPr>
+          <w:rFonts w:ascii="PT Sans" w:hAnsi="PT Sans"/>
+          <w:color w:val="212529"/>
+        </w:rPr>
+        <w:t>is up to you!</w:t>
+      </w:r>
+    </w:p>
+    <w:p>
+      <w:pPr>
+        <w:pStyle w:val="NormalWeb"/>
+        <w:spacing w:before="0" w:beforeAutospacing="0"/>
+        <w:rPr>
+          <w:rFonts w:ascii="PT Sans" w:hAnsi="PT Sans"/>
+          <w:color w:val="212529"/>
+        </w:rPr>
+      </w:pPr>
+      <w:r>
+        <w:rPr>
+          <w:rFonts w:ascii="PT Sans" w:hAnsi="PT Sans"/>
+          <w:color w:val="212529"/>
+        </w:rPr>
+        <w:t>Note that row counts do not include header rows that only show column names.</w:t>
+      </w:r>
+    </w:p>
+    <w:p>
+      <w:pPr>
+        <w:rPr>
+          <w:rFonts w:ascii="Times New Roman" w:hAnsi="Times New Roman"/>
+        </w:rPr>
+      </w:pPr>
+    </w:p>
+    <w:p>
+      <w:pPr>
+        <w:spacing w:before="100" w:beforeAutospacing="1" w:after="0" w:line="240" w:lineRule="auto"/>
+        <w:rPr>
+          <w:rFonts w:ascii="Tahoma" w:eastAsia="Times New Roman" w:hAnsi="Tahoma" w:cs="Tahoma"/>
+          <w:color w:val="000000" w:themeColor="text1"/>
+          <w:kern w:val="0"/>
+          <w:lang w:eastAsia="en-GB"/>
+          <w14:ligatures w14:val="none"/>
+        </w:rPr>
+      </w:pPr>
+    </w:p>
+    <w:p>
+      <w:pPr>
         <w:spacing w:after="0" w:line="240" w:lineRule="auto"/>
         <w:rPr>
           <w:rFonts w:ascii="Times New Roman" w:eastAsia="Times New Roman" w:hAnsi="Times New Roman" w:cs="Times New Roman"/>
@@ -1477,9 +2144,9 @@
 <file path=word/numbering.xml><?xml version="1.0" encoding="utf-8"?>
 <w:numbering xmlns:wpc="http://schemas.microsoft.com/office/word/2010/wordprocessingCanvas" xmlns:cx="http://schemas.microsoft.com/office/drawing/2014/chartex" xmlns:cx1="http://schemas.microsoft.com/office/drawing/2015/9/8/chartex" xmlns:cx2="http://schemas.microsoft.com/office/drawing/2015/10/21/chartex" xmlns:cx3="http://schemas.microsoft.com/office/drawing/2016/5/9/chartex" xmlns:cx4="http://schemas.microsoft.com/office/drawing/2016/5/10/chartex" xmlns:cx5="http://schemas.microsoft.com/office/drawing/2016/5/11/chartex" xmlns:cx6="http://schemas.microsoft.com/office/drawing/2016/5/12/chartex" xmlns:cx7="http://schemas.microsoft.com/office/drawing/2016/5/13/chartex" xmlns:cx8="http://schemas.microsoft.com/office/drawing/2016/5/14/chartex" xmlns:mc="http://schemas.openxmlformats.org/markup-compatibility/2006" xmlns:aink="http://schemas.microsoft.com/office/drawing/2016/ink" xmlns:am3d="http://schemas.microsoft.com/office/drawing/2017/model3d" xmlns:o="urn:schemas-microsoft-com:office:office" xmlns:oel="http://schemas.microsoft.com/office/2019/extlst" xmlns:r="http://schemas.openxmlformats.org/officeDocument/2006/relationships" xmlns:m="http://schemas.openxmlformats.org/officeDocument/2006/math" xmlns:v="urn:schemas-microsoft-com:vml" xmlns:wp14="http://schemas.microsoft.com/office/word/2010/wordprocessingDrawing" xmlns:wp="http://schemas.openxmlformats.org/drawingml/2006/wordprocessingDrawing" xmlns:w10="urn:schemas-microsoft-com:office:word" xmlns:w="http://schemas.openxmlformats.org/wordprocessingml/2006/main" xmlns:w14="http://schemas.microsoft.com/office/word/2010/wordml" xmlns:w15="http://schemas.microsoft.com/office/word/2012/wordml" xmlns:w16cex="http://schemas.microsoft.com/office/word/2018/wordml/cex" xmlns:w16cid="http://schemas.microsoft.com/office/word/2016/wordml/cid" xmlns:w16="http://schemas.microsoft.com/office/word/2018/wordml" xmlns:w16du="http://schemas.microsoft.com/office/word/2023/wordml/word16du" xmlns:w16sdtdh="http://schemas.microsoft.com/office/word/2020/wordml/sdtdatahash" xmlns:w16sdtfl="http://schemas.microsoft.com/office/word/2024/wordml/sdtformatlock" xmlns:w16se="http://schemas.microsoft.com/office/word/2015/wordml/symex" xmlns:wpg="http://schemas.microsoft.com/office/word/2010/wordprocessingGroup" xmlns:wpi="http://schemas.microsoft.com/office/word/2010/wordprocessingInk" xmlns:wne="http://schemas.microsoft.com/office/word/2006/wordml" xmlns:wps="http://schemas.microsoft.com/office/word/2010/wordprocessingShape" mc:Ignorable="w14 w15 w16se w16cid w16 w16cex w16sdtdh w16sdtfl w16du wp14">
   <w:abstractNum w:abstractNumId="0" w15:restartNumberingAfterBreak="0">
-    <w:nsid w:val="710D519C"/>
+    <w:nsid w:val="103C79A9"/>
     <w:multiLevelType w:val="multilevel"/>
-    <w:tmpl w:val="0324C348"/>
+    <w:tmpl w:val="3E9EBEB4"/>
     <w:lvl w:ilvl="0">
       <w:start w:val="1"/>
       <w:numFmt w:val="bullet"/>
@@ -1626,6 +2293,155 @@
     </w:lvl>
   </w:abstractNum>
   <w:abstractNum w:abstractNumId="1" w15:restartNumberingAfterBreak="0">
+    <w:nsid w:val="710D519C"/>
+    <w:multiLevelType w:val="multilevel"/>
+    <w:tmpl w:val="0324C348"/>
+    <w:lvl w:ilvl="0">
+      <w:start w:val="1"/>
+      <w:numFmt w:val="bullet"/>
+      <w:lvlText w:val=""/>
+      <w:lvlJc w:val="left"/>
+      <w:pPr>
+        <w:tabs>
+          <w:tab w:val="num" w:pos="720"/>
+        </w:tabs>
+        <w:ind w:left="720" w:hanging="360"/>
+      </w:pPr>
+      <w:rPr>
+        <w:rFonts w:ascii="Symbol" w:hAnsi="Symbol" w:hint="default"/>
+        <w:sz w:val="20"/>
+      </w:rPr>
+    </w:lvl>
+    <w:lvl w:ilvl="1" w:tentative="1">
+      <w:start w:val="1"/>
+      <w:numFmt w:val="bullet"/>
+      <w:lvlText w:val="o"/>
+      <w:lvlJc w:val="left"/>
+      <w:pPr>
+        <w:tabs>
+          <w:tab w:val="num" w:pos="1440"/>
+        </w:tabs>
+        <w:ind w:left="1440" w:hanging="360"/>
+      </w:pPr>
+      <w:rPr>
+        <w:rFonts w:ascii="Courier New" w:hAnsi="Courier New" w:hint="default"/>
+        <w:sz w:val="20"/>
+      </w:rPr>
+    </w:lvl>
+    <w:lvl w:ilvl="2" w:tentative="1">
+      <w:start w:val="1"/>
+      <w:numFmt w:val="bullet"/>
+      <w:lvlText w:val=""/>
+      <w:lvlJc w:val="left"/>
+      <w:pPr>
+        <w:tabs>
+          <w:tab w:val="num" w:pos="2160"/>
+        </w:tabs>
+        <w:ind w:left="2160" w:hanging="360"/>
+      </w:pPr>
+      <w:rPr>
+        <w:rFonts w:ascii="Wingdings" w:hAnsi="Wingdings" w:hint="default"/>
+        <w:sz w:val="20"/>
+      </w:rPr>
+    </w:lvl>
+    <w:lvl w:ilvl="3" w:tentative="1">
+      <w:start w:val="1"/>
+      <w:numFmt w:val="bullet"/>
+      <w:lvlText w:val=""/>
+      <w:lvlJc w:val="left"/>
+      <w:pPr>
+        <w:tabs>
+          <w:tab w:val="num" w:pos="2880"/>
+        </w:tabs>
+        <w:ind w:left="2880" w:hanging="360"/>
+      </w:pPr>
+      <w:rPr>
+        <w:rFonts w:ascii="Wingdings" w:hAnsi="Wingdings" w:hint="default"/>
+        <w:sz w:val="20"/>
+      </w:rPr>
+    </w:lvl>
+    <w:lvl w:ilvl="4" w:tentative="1">
+      <w:start w:val="1"/>
+      <w:numFmt w:val="bullet"/>
+      <w:lvlText w:val=""/>
+      <w:lvlJc w:val="left"/>
+      <w:pPr>
+        <w:tabs>
+          <w:tab w:val="num" w:pos="3600"/>
+        </w:tabs>
+        <w:ind w:left="3600" w:hanging="360"/>
+      </w:pPr>
+      <w:rPr>
+        <w:rFonts w:ascii="Wingdings" w:hAnsi="Wingdings" w:hint="default"/>
+        <w:sz w:val="20"/>
+      </w:rPr>
+    </w:lvl>
+    <w:lvl w:ilvl="5" w:tentative="1">
+      <w:start w:val="1"/>
+      <w:numFmt w:val="bullet"/>
+      <w:lvlText w:val=""/>
+      <w:lvlJc w:val="left"/>
+      <w:pPr>
+        <w:tabs>
+          <w:tab w:val="num" w:pos="4320"/>
+        </w:tabs>
+        <w:ind w:left="4320" w:hanging="360"/>
+      </w:pPr>
+      <w:rPr>
+        <w:rFonts w:ascii="Wingdings" w:hAnsi="Wingdings" w:hint="default"/>
+        <w:sz w:val="20"/>
+      </w:rPr>
+    </w:lvl>
+    <w:lvl w:ilvl="6" w:tentative="1">
+      <w:start w:val="1"/>
+      <w:numFmt w:val="bullet"/>
+      <w:lvlText w:val=""/>
+      <w:lvlJc w:val="left"/>
+      <w:pPr>
+        <w:tabs>
+          <w:tab w:val="num" w:pos="5040"/>
+        </w:tabs>
+        <w:ind w:left="5040" w:hanging="360"/>
+      </w:pPr>
+      <w:rPr>
+        <w:rFonts w:ascii="Wingdings" w:hAnsi="Wingdings" w:hint="default"/>
+        <w:sz w:val="20"/>
+      </w:rPr>
+    </w:lvl>
+    <w:lvl w:ilvl="7" w:tentative="1">
+      <w:start w:val="1"/>
+      <w:numFmt w:val="bullet"/>
+      <w:lvlText w:val=""/>
+      <w:lvlJc w:val="left"/>
+      <w:pPr>
+        <w:tabs>
+          <w:tab w:val="num" w:pos="5760"/>
+        </w:tabs>
+        <w:ind w:left="5760" w:hanging="360"/>
+      </w:pPr>
+      <w:rPr>
+        <w:rFonts w:ascii="Wingdings" w:hAnsi="Wingdings" w:hint="default"/>
+        <w:sz w:val="20"/>
+      </w:rPr>
+    </w:lvl>
+    <w:lvl w:ilvl="8" w:tentative="1">
+      <w:start w:val="1"/>
+      <w:numFmt w:val="bullet"/>
+      <w:lvlText w:val=""/>
+      <w:lvlJc w:val="left"/>
+      <w:pPr>
+        <w:tabs>
+          <w:tab w:val="num" w:pos="6480"/>
+        </w:tabs>
+        <w:ind w:left="6480" w:hanging="360"/>
+      </w:pPr>
+      <w:rPr>
+        <w:rFonts w:ascii="Wingdings" w:hAnsi="Wingdings" w:hint="default"/>
+        <w:sz w:val="20"/>
+      </w:rPr>
+    </w:lvl>
+  </w:abstractNum>
+  <w:abstractNum w:abstractNumId="2" w15:restartNumberingAfterBreak="0">
     <w:nsid w:val="75A05D8F"/>
     <w:multiLevelType w:val="multilevel"/>
     <w:tmpl w:val="E2A45F9E"/>
@@ -1743,10 +2559,13 @@
     </w:lvl>
   </w:abstractNum>
   <w:num w:numId="1" w16cid:durableId="251545786">
-    <w:abstractNumId w:val="0"/>
+    <w:abstractNumId w:val="1"/>
   </w:num>
   <w:num w:numId="2" w16cid:durableId="1210144250">
-    <w:abstractNumId w:val="1"/>
+    <w:abstractNumId w:val="2"/>
+  </w:num>
+  <w:num w:numId="3" w16cid:durableId="975258941">
+    <w:abstractNumId w:val="0"/>
   </w:num>
 </w:numbering>
 </file>
@@ -2179,7 +2998,6 @@
     <w:next w:val="Normal"/>
     <w:link w:val="Heading2Char"/>
     <w:uiPriority w:val="9"/>
-    <w:semiHidden/>
     <w:unhideWhenUsed/>
     <w:qFormat/>
     <w:rsid w:val="008F1E6F"/>
@@ -2396,7 +3214,6 @@
     <w:basedOn w:val="DefaultParagraphFont"/>
     <w:link w:val="Heading2"/>
     <w:uiPriority w:val="9"/>
-    <w:semiHidden/>
     <w:rsid w:val="008F1E6F"/>
     <w:rPr>
       <w:rFonts w:asciiTheme="majorHAnsi" w:eastAsiaTheme="majorEastAsia" w:hAnsiTheme="majorHAnsi" w:cstheme="majorBidi"/>

</xml_diff>